<commit_message>
committed to main branch: pipes
</commit_message>
<xml_diff>
--- a/doc-images/Data_Passing_Btn_Comps.docx
+++ b/doc-images/Data_Passing_Btn_Comps.docx
@@ -3,6 +3,432 @@
 <w:document xmlns:wpc="http://schemas.microsoft.com/office/word/2010/wordprocessingCanvas" xmlns:cx="http://schemas.microsoft.com/office/drawing/2014/chartex" xmlns:cx1="http://schemas.microsoft.com/office/drawing/2015/9/8/chartex" xmlns:cx2="http://schemas.microsoft.com/office/drawing/2015/10/21/chartex" xmlns:cx3="http://schemas.microsoft.com/office/drawing/2016/5/9/chartex" xmlns:cx4="http://schemas.microsoft.com/office/drawing/2016/5/10/chartex" xmlns:cx5="http://schemas.microsoft.com/office/drawing/2016/5/11/chartex" xmlns:cx6="http://schemas.microsoft.com/office/drawing/2016/5/12/chartex" xmlns:cx7="http://schemas.microsoft.com/office/drawing/2016/5/13/chartex" xmlns:cx8="http://schemas.microsoft.com/office/drawing/2016/5/14/chartex" xmlns:mc="http://schemas.openxmlformats.org/markup-compatibility/2006" xmlns:aink="http://schemas.microsoft.com/office/drawing/2016/ink" xmlns:am3d="http://schemas.microsoft.com/office/drawing/2017/model3d" xmlns:o="urn:schemas-microsoft-com:office:office" xmlns:oel="http://schemas.microsoft.com/office/2019/extlst" xmlns:r="http://schemas.openxmlformats.org/officeDocument/2006/relationships" xmlns:m="http://schemas.openxmlformats.org/officeDocument/2006/math" xmlns:v="urn:schemas-microsoft-com:vml" xmlns:wp14="http://schemas.microsoft.com/office/word/2010/wordprocessingDrawing" xmlns:wp="http://schemas.openxmlformats.org/drawingml/2006/wordprocessingDrawing" xmlns:w10="urn:schemas-microsoft-com:office:word" xmlns:w="http://schemas.openxmlformats.org/wordprocessingml/2006/main" xmlns:w14="http://schemas.microsoft.com/office/word/2010/wordml" xmlns:w15="http://schemas.microsoft.com/office/word/2012/wordml" xmlns:w16cex="http://schemas.microsoft.com/office/word/2018/wordml/cex" xmlns:w16cid="http://schemas.microsoft.com/office/word/2016/wordml/cid" xmlns:w16="http://schemas.microsoft.com/office/word/2018/wordml" xmlns:w16du="http://schemas.microsoft.com/office/word/2023/wordml/word16du" xmlns:w16sdtdh="http://schemas.microsoft.com/office/word/2020/wordml/sdtdatahash" xmlns:w16sdtfl="http://schemas.microsoft.com/office/word/2024/wordml/sdtformatlock" xmlns:w16se="http://schemas.microsoft.com/office/word/2015/wordml/symex" xmlns:wpg="http://schemas.microsoft.com/office/word/2010/wordprocessingGroup" xmlns:wpi="http://schemas.microsoft.com/office/word/2010/wordprocessingInk" xmlns:wne="http://schemas.microsoft.com/office/word/2006/wordml" xmlns:wps="http://schemas.microsoft.com/office/word/2010/wordprocessingShape" mc:Ignorable="w14 w15 w16se w16cid w16 w16cex w16sdtdh w16sdtfl w16du wp14">
   <w:body>
     <w:p>
+      <w:r>
+        <w:rPr>
+          <w:noProof/>
+        </w:rPr>
+        <mc:AlternateContent>
+          <mc:Choice Requires="wps">
+            <w:drawing>
+              <wp:anchor distT="0" distB="0" distL="114300" distR="114300" simplePos="0" relativeHeight="251689984" behindDoc="0" locked="0" layoutInCell="1" allowOverlap="1" wp14:anchorId="1D51FBB9" wp14:editId="251A7678">
+                <wp:simplePos x="0" y="0"/>
+                <wp:positionH relativeFrom="column">
+                  <wp:posOffset>2915478</wp:posOffset>
+                </wp:positionH>
+                <wp:positionV relativeFrom="paragraph">
+                  <wp:posOffset>4618383</wp:posOffset>
+                </wp:positionV>
+                <wp:extent cx="2239618" cy="545465"/>
+                <wp:effectExtent l="0" t="0" r="27940" b="26035"/>
+                <wp:wrapNone/>
+                <wp:docPr id="186922279" name="Text Box 27"/>
+                <wp:cNvGraphicFramePr/>
+                <a:graphic xmlns:a="http://schemas.openxmlformats.org/drawingml/2006/main">
+                  <a:graphicData uri="http://schemas.microsoft.com/office/word/2010/wordprocessingShape">
+                    <wps:wsp>
+                      <wps:cNvSpPr txBox="1"/>
+                      <wps:spPr>
+                        <a:xfrm>
+                          <a:off x="0" y="0"/>
+                          <a:ext cx="2239618" cy="545465"/>
+                        </a:xfrm>
+                        <a:prstGeom prst="rect">
+                          <a:avLst/>
+                        </a:prstGeom>
+                        <a:solidFill>
+                          <a:schemeClr val="lt1"/>
+                        </a:solidFill>
+                        <a:ln w="6350">
+                          <a:solidFill>
+                            <a:prstClr val="black"/>
+                          </a:solidFill>
+                        </a:ln>
+                      </wps:spPr>
+                      <wps:txbx>
+                        <w:txbxContent>
+                          <w:p>
+                            <w:r>
+                              <w:t>&lt;app-</w:t>
+                            </w:r>
+                            <w:r>
+                              <w:t xml:space="preserve">product-list </w:t>
+                            </w:r>
+                            <w:r>
+                              <w:t>[</w:t>
+                            </w:r>
+                            <w:proofErr w:type="spellStart"/>
+                            <w:r>
+                              <w:t>filterData</w:t>
+                            </w:r>
+                            <w:proofErr w:type="spellEnd"/>
+                            <w:r>
+                              <w:t>]=”</w:t>
+                            </w:r>
+                            <w:r>
+                              <w:t xml:space="preserve"> </w:t>
+                            </w:r>
+                            <w:proofErr w:type="spellStart"/>
+                            <w:r>
+                              <w:t>filterTextValue</w:t>
+                            </w:r>
+                            <w:proofErr w:type="spellEnd"/>
+                            <w:r>
+                              <w:t>”&gt;</w:t>
+                            </w:r>
+                          </w:p>
+                        </w:txbxContent>
+                      </wps:txbx>
+                      <wps:bodyPr rot="0" spcFirstLastPara="0" vertOverflow="overflow" horzOverflow="overflow" vert="horz" wrap="square" lIns="91440" tIns="45720" rIns="91440" bIns="45720" numCol="1" spcCol="0" rtlCol="0" fromWordArt="0" anchor="t" anchorCtr="0" forceAA="0" compatLnSpc="1">
+                        <a:prstTxWarp prst="textNoShape">
+                          <a:avLst/>
+                        </a:prstTxWarp>
+                        <a:noAutofit/>
+                      </wps:bodyPr>
+                    </wps:wsp>
+                  </a:graphicData>
+                </a:graphic>
+                <wp14:sizeRelH relativeFrom="margin">
+                  <wp14:pctWidth>0</wp14:pctWidth>
+                </wp14:sizeRelH>
+              </wp:anchor>
+            </w:drawing>
+          </mc:Choice>
+          <mc:Fallback>
+            <w:pict>
+              <v:shapetype w14:anchorId="1D51FBB9" id="_x0000_t202" coordsize="21600,21600" o:spt="202" path="m,l,21600r21600,l21600,xe">
+                <v:stroke joinstyle="miter"/>
+                <v:path gradientshapeok="t" o:connecttype="rect"/>
+              </v:shapetype>
+              <v:shape id="Text Box 27" o:spid="_x0000_s1026" type="#_x0000_t202" style="position:absolute;margin-left:229.55pt;margin-top:363.65pt;width:176.35pt;height:42.95pt;z-index:251689984;visibility:visible;mso-wrap-style:square;mso-width-percent:0;mso-wrap-distance-left:9pt;mso-wrap-distance-top:0;mso-wrap-distance-right:9pt;mso-wrap-distance-bottom:0;mso-position-horizontal:absolute;mso-position-horizontal-relative:text;mso-position-vertical:absolute;mso-position-vertical-relative:text;mso-width-percent:0;mso-width-relative:margin;v-text-anchor:top" o:gfxdata="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" fillcolor="white [3201]" strokeweight=".5pt">
+                <v:textbox>
+                  <w:txbxContent>
+                    <w:p>
+                      <w:r>
+                        <w:t>&lt;app-</w:t>
+                      </w:r>
+                      <w:r>
+                        <w:t xml:space="preserve">product-list </w:t>
+                      </w:r>
+                      <w:r>
+                        <w:t>[</w:t>
+                      </w:r>
+                      <w:proofErr w:type="spellStart"/>
+                      <w:r>
+                        <w:t>filterData</w:t>
+                      </w:r>
+                      <w:proofErr w:type="spellEnd"/>
+                      <w:r>
+                        <w:t>]=”</w:t>
+                      </w:r>
+                      <w:r>
+                        <w:t xml:space="preserve"> </w:t>
+                      </w:r>
+                      <w:proofErr w:type="spellStart"/>
+                      <w:r>
+                        <w:t>filterTextValue</w:t>
+                      </w:r>
+                      <w:proofErr w:type="spellEnd"/>
+                      <w:r>
+                        <w:t>”&gt;</w:t>
+                      </w:r>
+                    </w:p>
+                  </w:txbxContent>
+                </v:textbox>
+              </v:shape>
+            </w:pict>
+          </mc:Fallback>
+        </mc:AlternateContent>
+      </w:r>
+      <w:r>
+        <w:rPr>
+          <w:noProof/>
+        </w:rPr>
+        <mc:AlternateContent>
+          <mc:Choice Requires="wps">
+            <w:drawing>
+              <wp:anchor distT="0" distB="0" distL="114300" distR="114300" simplePos="0" relativeHeight="251681792" behindDoc="0" locked="0" layoutInCell="1" allowOverlap="1" wp14:anchorId="702F85D1" wp14:editId="6BBBB4C4">
+                <wp:simplePos x="0" y="0"/>
+                <wp:positionH relativeFrom="column">
+                  <wp:posOffset>1755912</wp:posOffset>
+                </wp:positionH>
+                <wp:positionV relativeFrom="paragraph">
+                  <wp:posOffset>3316357</wp:posOffset>
+                </wp:positionV>
+                <wp:extent cx="1265583" cy="605155"/>
+                <wp:effectExtent l="0" t="0" r="10795" b="23495"/>
+                <wp:wrapNone/>
+                <wp:docPr id="1183498678" name="Text Box 21"/>
+                <wp:cNvGraphicFramePr/>
+                <a:graphic xmlns:a="http://schemas.openxmlformats.org/drawingml/2006/main">
+                  <a:graphicData uri="http://schemas.microsoft.com/office/word/2010/wordprocessingShape">
+                    <wps:wsp>
+                      <wps:cNvSpPr txBox="1"/>
+                      <wps:spPr>
+                        <a:xfrm>
+                          <a:off x="0" y="0"/>
+                          <a:ext cx="1265583" cy="605155"/>
+                        </a:xfrm>
+                        <a:prstGeom prst="rect">
+                          <a:avLst/>
+                        </a:prstGeom>
+                        <a:solidFill>
+                          <a:schemeClr val="lt1"/>
+                        </a:solidFill>
+                        <a:ln w="6350">
+                          <a:solidFill>
+                            <a:prstClr val="black"/>
+                          </a:solidFill>
+                        </a:ln>
+                      </wps:spPr>
+                      <wps:txbx>
+                        <w:txbxContent>
+                          <w:p>
+                            <w:pPr>
+                              <w:rPr>
+                                <w:sz w:val="14"/>
+                                <w:szCs w:val="14"/>
+                              </w:rPr>
+                            </w:pPr>
+                            <w:proofErr w:type="spellStart"/>
+                            <w:r>
+                              <w:rPr>
+                                <w:sz w:val="14"/>
+                                <w:szCs w:val="14"/>
+                              </w:rPr>
+                              <w:t>onFilterValueChanged</w:t>
+                            </w:r>
+                            <w:proofErr w:type="spellEnd"/>
+                            <w:r>
+                              <w:rPr>
+                                <w:sz w:val="14"/>
+                                <w:szCs w:val="14"/>
+                              </w:rPr>
+                              <w:t>(data</w:t>
+                            </w:r>
+                            <w:proofErr w:type="gramStart"/>
+                            <w:r>
+                              <w:rPr>
+                                <w:sz w:val="14"/>
+                                <w:szCs w:val="14"/>
+                              </w:rPr>
+                              <w:t xml:space="preserve">){ </w:t>
+                            </w:r>
+                            <w:proofErr w:type="spellStart"/>
+                            <w:r>
+                              <w:rPr>
+                                <w:sz w:val="14"/>
+                                <w:szCs w:val="14"/>
+                              </w:rPr>
+                              <w:t>filterValueChanged</w:t>
+                            </w:r>
+                            <w:r>
+                              <w:rPr>
+                                <w:sz w:val="14"/>
+                                <w:szCs w:val="14"/>
+                              </w:rPr>
+                              <w:t>.emit</w:t>
+                            </w:r>
+                            <w:proofErr w:type="spellEnd"/>
+                            <w:proofErr w:type="gramEnd"/>
+                            <w:r>
+                              <w:rPr>
+                                <w:sz w:val="14"/>
+                                <w:szCs w:val="14"/>
+                              </w:rPr>
+                              <w:t>(</w:t>
+                            </w:r>
+                            <w:proofErr w:type="spellStart"/>
+                            <w:r>
+                              <w:rPr>
+                                <w:sz w:val="14"/>
+                                <w:szCs w:val="14"/>
+                              </w:rPr>
+                              <w:t>filterValue</w:t>
+                            </w:r>
+                            <w:proofErr w:type="spellEnd"/>
+                            <w:r>
+                              <w:rPr>
+                                <w:sz w:val="14"/>
+                                <w:szCs w:val="14"/>
+                              </w:rPr>
+                              <w:t>)}</w:t>
+                            </w:r>
+                          </w:p>
+                        </w:txbxContent>
+                      </wps:txbx>
+                      <wps:bodyPr rot="0" spcFirstLastPara="0" vertOverflow="overflow" horzOverflow="overflow" vert="horz" wrap="square" lIns="91440" tIns="45720" rIns="91440" bIns="45720" numCol="1" spcCol="0" rtlCol="0" fromWordArt="0" anchor="t" anchorCtr="0" forceAA="0" compatLnSpc="1">
+                        <a:prstTxWarp prst="textNoShape">
+                          <a:avLst/>
+                        </a:prstTxWarp>
+                        <a:noAutofit/>
+                      </wps:bodyPr>
+                    </wps:wsp>
+                  </a:graphicData>
+                </a:graphic>
+                <wp14:sizeRelH relativeFrom="margin">
+                  <wp14:pctWidth>0</wp14:pctWidth>
+                </wp14:sizeRelH>
+              </wp:anchor>
+            </w:drawing>
+          </mc:Choice>
+          <mc:Fallback>
+            <w:pict>
+              <v:shape w14:anchorId="702F85D1" id="Text Box 21" o:spid="_x0000_s1027" type="#_x0000_t202" style="position:absolute;margin-left:138.25pt;margin-top:261.15pt;width:99.65pt;height:47.65pt;z-index:251681792;visibility:visible;mso-wrap-style:square;mso-width-percent:0;mso-wrap-distance-left:9pt;mso-wrap-distance-top:0;mso-wrap-distance-right:9pt;mso-wrap-distance-bottom:0;mso-position-horizontal:absolute;mso-position-horizontal-relative:text;mso-position-vertical:absolute;mso-position-vertical-relative:text;mso-width-percent:0;mso-width-relative:margin;v-text-anchor:top" o:gfxdata="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" fillcolor="white [3201]" strokeweight=".5pt">
+                <v:textbox>
+                  <w:txbxContent>
+                    <w:p>
+                      <w:pPr>
+                        <w:rPr>
+                          <w:sz w:val="14"/>
+                          <w:szCs w:val="14"/>
+                        </w:rPr>
+                      </w:pPr>
+                      <w:proofErr w:type="spellStart"/>
+                      <w:r>
+                        <w:rPr>
+                          <w:sz w:val="14"/>
+                          <w:szCs w:val="14"/>
+                        </w:rPr>
+                        <w:t>onFilterValueChanged</w:t>
+                      </w:r>
+                      <w:proofErr w:type="spellEnd"/>
+                      <w:r>
+                        <w:rPr>
+                          <w:sz w:val="14"/>
+                          <w:szCs w:val="14"/>
+                        </w:rPr>
+                        <w:t>(data</w:t>
+                      </w:r>
+                      <w:proofErr w:type="gramStart"/>
+                      <w:r>
+                        <w:rPr>
+                          <w:sz w:val="14"/>
+                          <w:szCs w:val="14"/>
+                        </w:rPr>
+                        <w:t xml:space="preserve">){ </w:t>
+                      </w:r>
+                      <w:proofErr w:type="spellStart"/>
+                      <w:r>
+                        <w:rPr>
+                          <w:sz w:val="14"/>
+                          <w:szCs w:val="14"/>
+                        </w:rPr>
+                        <w:t>filterValueChanged</w:t>
+                      </w:r>
+                      <w:r>
+                        <w:rPr>
+                          <w:sz w:val="14"/>
+                          <w:szCs w:val="14"/>
+                        </w:rPr>
+                        <w:t>.emit</w:t>
+                      </w:r>
+                      <w:proofErr w:type="spellEnd"/>
+                      <w:proofErr w:type="gramEnd"/>
+                      <w:r>
+                        <w:rPr>
+                          <w:sz w:val="14"/>
+                          <w:szCs w:val="14"/>
+                        </w:rPr>
+                        <w:t>(</w:t>
+                      </w:r>
+                      <w:proofErr w:type="spellStart"/>
+                      <w:r>
+                        <w:rPr>
+                          <w:sz w:val="14"/>
+                          <w:szCs w:val="14"/>
+                        </w:rPr>
+                        <w:t>filterValue</w:t>
+                      </w:r>
+                      <w:proofErr w:type="spellEnd"/>
+                      <w:r>
+                        <w:rPr>
+                          <w:sz w:val="14"/>
+                          <w:szCs w:val="14"/>
+                        </w:rPr>
+                        <w:t>)}</w:t>
+                      </w:r>
+                    </w:p>
+                  </w:txbxContent>
+                </v:textbox>
+              </v:shape>
+            </w:pict>
+          </mc:Fallback>
+        </mc:AlternateContent>
+      </w:r>
+      <w:r>
+        <w:rPr>
+          <w:noProof/>
+        </w:rPr>
+        <mc:AlternateContent>
+          <mc:Choice Requires="wps">
+            <w:drawing>
+              <wp:anchor distT="0" distB="0" distL="114300" distR="114300" simplePos="0" relativeHeight="251671552" behindDoc="0" locked="0" layoutInCell="1" allowOverlap="1" wp14:anchorId="06F69641" wp14:editId="6A3CA4C5">
+                <wp:simplePos x="0" y="0"/>
+                <wp:positionH relativeFrom="column">
+                  <wp:posOffset>155713</wp:posOffset>
+                </wp:positionH>
+                <wp:positionV relativeFrom="paragraph">
+                  <wp:posOffset>2266122</wp:posOffset>
+                </wp:positionV>
+                <wp:extent cx="5307496" cy="3136127"/>
+                <wp:effectExtent l="0" t="0" r="26670" b="26670"/>
+                <wp:wrapNone/>
+                <wp:docPr id="646926162" name="Rectangle 11"/>
+                <wp:cNvGraphicFramePr/>
+                <a:graphic xmlns:a="http://schemas.openxmlformats.org/drawingml/2006/main">
+                  <a:graphicData uri="http://schemas.microsoft.com/office/word/2010/wordprocessingShape">
+                    <wps:wsp>
+                      <wps:cNvSpPr/>
+                      <wps:spPr>
+                        <a:xfrm>
+                          <a:off x="0" y="0"/>
+                          <a:ext cx="5307496" cy="3136127"/>
+                        </a:xfrm>
+                        <a:prstGeom prst="rect">
+                          <a:avLst/>
+                        </a:prstGeom>
+                      </wps:spPr>
+                      <wps:style>
+                        <a:lnRef idx="2">
+                          <a:schemeClr val="accent1">
+                            <a:shade val="15000"/>
+                          </a:schemeClr>
+                        </a:lnRef>
+                        <a:fillRef idx="1">
+                          <a:schemeClr val="accent1"/>
+                        </a:fillRef>
+                        <a:effectRef idx="0">
+                          <a:schemeClr val="accent1"/>
+                        </a:effectRef>
+                        <a:fontRef idx="minor">
+                          <a:schemeClr val="lt1"/>
+                        </a:fontRef>
+                      </wps:style>
+                      <wps:bodyPr rot="0" spcFirstLastPara="0" vertOverflow="overflow" horzOverflow="overflow" vert="horz" wrap="square" lIns="91440" tIns="45720" rIns="91440" bIns="45720" numCol="1" spcCol="0" rtlCol="0" fromWordArt="0" anchor="ctr" anchorCtr="0" forceAA="0" compatLnSpc="1">
+                        <a:prstTxWarp prst="textNoShape">
+                          <a:avLst/>
+                        </a:prstTxWarp>
+                        <a:noAutofit/>
+                      </wps:bodyPr>
+                    </wps:wsp>
+                  </a:graphicData>
+                </a:graphic>
+                <wp14:sizeRelH relativeFrom="margin">
+                  <wp14:pctWidth>0</wp14:pctWidth>
+                </wp14:sizeRelH>
+                <wp14:sizeRelV relativeFrom="margin">
+                  <wp14:pctHeight>0</wp14:pctHeight>
+                </wp14:sizeRelV>
+              </wp:anchor>
+            </w:drawing>
+          </mc:Choice>
+          <mc:Fallback>
+            <w:pict>
+              <v:rect w14:anchorId="0D041147" id="Rectangle 11" o:spid="_x0000_s1026" style="position:absolute;margin-left:12.25pt;margin-top:178.45pt;width:417.9pt;height:246.95pt;z-index:251671552;visibility:visible;mso-wrap-style:square;mso-width-percent:0;mso-height-percent:0;mso-wrap-distance-left:9pt;mso-wrap-distance-top:0;mso-wrap-distance-right:9pt;mso-wrap-distance-bottom:0;mso-position-horizontal:absolute;mso-position-horizontal-relative:text;mso-position-vertical:absolute;mso-position-vertical-relative:text;mso-width-percent:0;mso-height-percent:0;mso-width-relative:margin;mso-height-relative:margin;v-text-anchor:middle" o:gfxdata="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" fillcolor="#156082 [3204]" strokecolor="#030e13 [484]" strokeweight="1.5pt"/>
+            </w:pict>
+          </mc:Fallback>
+        </mc:AlternateContent>
+      </w:r>
       <w:r>
         <w:rPr>
           <w:noProof/>
@@ -80,7 +506,7 @@
         <mc:AlternateContent>
           <mc:Choice Requires="wps">
             <w:drawing>
-              <wp:anchor distT="0" distB="0" distL="114300" distR="114300" simplePos="0" relativeHeight="251691008" behindDoc="0" locked="0" layoutInCell="1" allowOverlap="1" wp14:anchorId="1B22608A" wp14:editId="469D7637">
+              <wp:anchor distT="0" distB="0" distL="114300" distR="114300" simplePos="0" relativeHeight="251691008" behindDoc="0" locked="0" layoutInCell="1" allowOverlap="1" wp14:anchorId="1B22608A" wp14:editId="6335608B">
                 <wp:simplePos x="0" y="0"/>
                 <wp:positionH relativeFrom="column">
                   <wp:posOffset>3697224</wp:posOffset>
@@ -132,107 +558,12 @@
           </mc:Choice>
           <mc:Fallback>
             <w:pict>
-              <v:shape w14:anchorId="583E993E" id="Straight Arrow Connector 28" o:spid="_x0000_s1026" type="#_x0000_t32" style="position:absolute;margin-left:291.1pt;margin-top:291.85pt;width:29.75pt;height:78.5pt;flip:x;z-index:251691008;visibility:visible;mso-wrap-style:square;mso-wrap-distance-left:9pt;mso-wrap-distance-top:0;mso-wrap-distance-right:9pt;mso-wrap-distance-bottom:0;mso-position-horizontal:absolute;mso-position-horizontal-relative:text;mso-position-vertical:absolute;mso-position-vertical-relative:text" o:gfxdata="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" strokecolor="#4ea72e [3209]" strokeweight="1pt">
+              <v:shapetype w14:anchorId="7D004A26" id="_x0000_t32" coordsize="21600,21600" o:spt="32" o:oned="t" path="m,l21600,21600e" filled="f">
+                <v:path arrowok="t" fillok="f" o:connecttype="none"/>
+                <o:lock v:ext="edit" shapetype="t"/>
+              </v:shapetype>
+              <v:shape id="Straight Arrow Connector 28" o:spid="_x0000_s1026" type="#_x0000_t32" style="position:absolute;margin-left:291.1pt;margin-top:291.85pt;width:29.75pt;height:78.5pt;flip:x;z-index:251691008;visibility:visible;mso-wrap-style:square;mso-wrap-distance-left:9pt;mso-wrap-distance-top:0;mso-wrap-distance-right:9pt;mso-wrap-distance-bottom:0;mso-position-horizontal:absolute;mso-position-horizontal-relative:text;mso-position-vertical:absolute;mso-position-vertical-relative:text" o:gfxdata="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" strokecolor="#4ea72e [3209]" strokeweight="1pt">
                 <v:stroke endarrow="block" joinstyle="miter"/>
-              </v:shape>
-            </w:pict>
-          </mc:Fallback>
-        </mc:AlternateContent>
-      </w:r>
-      <w:r>
-        <w:rPr>
-          <w:noProof/>
-        </w:rPr>
-        <mc:AlternateContent>
-          <mc:Choice Requires="wps">
-            <w:drawing>
-              <wp:anchor distT="0" distB="0" distL="114300" distR="114300" simplePos="0" relativeHeight="251689984" behindDoc="0" locked="0" layoutInCell="1" allowOverlap="1" wp14:anchorId="1D51FBB9" wp14:editId="4648C2A2">
-                <wp:simplePos x="0" y="0"/>
-                <wp:positionH relativeFrom="column">
-                  <wp:posOffset>2916936</wp:posOffset>
-                </wp:positionH>
-                <wp:positionV relativeFrom="paragraph">
-                  <wp:posOffset>4617720</wp:posOffset>
-                </wp:positionV>
-                <wp:extent cx="1865376" cy="545592"/>
-                <wp:effectExtent l="0" t="0" r="20955" b="26035"/>
-                <wp:wrapNone/>
-                <wp:docPr id="186922279" name="Text Box 27"/>
-                <wp:cNvGraphicFramePr/>
-                <a:graphic xmlns:a="http://schemas.openxmlformats.org/drawingml/2006/main">
-                  <a:graphicData uri="http://schemas.microsoft.com/office/word/2010/wordprocessingShape">
-                    <wps:wsp>
-                      <wps:cNvSpPr txBox="1"/>
-                      <wps:spPr>
-                        <a:xfrm>
-                          <a:off x="0" y="0"/>
-                          <a:ext cx="1865376" cy="545592"/>
-                        </a:xfrm>
-                        <a:prstGeom prst="rect">
-                          <a:avLst/>
-                        </a:prstGeom>
-                        <a:solidFill>
-                          <a:schemeClr val="lt1"/>
-                        </a:solidFill>
-                        <a:ln w="6350">
-                          <a:solidFill>
-                            <a:prstClr val="black"/>
-                          </a:solidFill>
-                        </a:ln>
-                      </wps:spPr>
-                      <wps:txbx>
-                        <w:txbxContent>
-                          <w:p>
-                            <w:r>
-                              <w:t>&lt;app-first [</w:t>
-                            </w:r>
-                            <w:proofErr w:type="spellStart"/>
-                            <w:r>
-                              <w:t>dataValue</w:t>
-                            </w:r>
-                            <w:proofErr w:type="spellEnd"/>
-                            <w:r>
-                              <w:t>]=”data”&gt;</w:t>
-                            </w:r>
-                          </w:p>
-                        </w:txbxContent>
-                      </wps:txbx>
-                      <wps:bodyPr rot="0" spcFirstLastPara="0" vertOverflow="overflow" horzOverflow="overflow" vert="horz" wrap="square" lIns="91440" tIns="45720" rIns="91440" bIns="45720" numCol="1" spcCol="0" rtlCol="0" fromWordArt="0" anchor="t" anchorCtr="0" forceAA="0" compatLnSpc="1">
-                        <a:prstTxWarp prst="textNoShape">
-                          <a:avLst/>
-                        </a:prstTxWarp>
-                        <a:noAutofit/>
-                      </wps:bodyPr>
-                    </wps:wsp>
-                  </a:graphicData>
-                </a:graphic>
-              </wp:anchor>
-            </w:drawing>
-          </mc:Choice>
-          <mc:Fallback>
-            <w:pict>
-              <v:shapetype w14:anchorId="1D51FBB9" id="_x0000_t202" coordsize="21600,21600" o:spt="202" path="m,l,21600r21600,l21600,xe">
-                <v:stroke joinstyle="miter"/>
-                <v:path gradientshapeok="t" o:connecttype="rect"/>
-              </v:shapetype>
-              <v:shape id="Text Box 27" o:spid="_x0000_s1026" type="#_x0000_t202" style="position:absolute;margin-left:229.7pt;margin-top:363.6pt;width:146.9pt;height:42.95pt;z-index:251689984;visibility:visible;mso-wrap-style:square;mso-wrap-distance-left:9pt;mso-wrap-distance-top:0;mso-wrap-distance-right:9pt;mso-wrap-distance-bottom:0;mso-position-horizontal:absolute;mso-position-horizontal-relative:text;mso-position-vertical:absolute;mso-position-vertical-relative:text;v-text-anchor:top" o:gfxdata="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" fillcolor="white [3201]" strokeweight=".5pt">
-                <v:textbox>
-                  <w:txbxContent>
-                    <w:p>
-                      <w:r>
-                        <w:t>&lt;app-first [</w:t>
-                      </w:r>
-                      <w:proofErr w:type="spellStart"/>
-                      <w:r>
-                        <w:t>dataValue</w:t>
-                      </w:r>
-                      <w:proofErr w:type="spellEnd"/>
-                      <w:r>
-                        <w:t>]=”data”&gt;</w:t>
-                      </w:r>
-                    </w:p>
-                  </w:txbxContent>
-                </v:textbox>
               </v:shape>
             </w:pict>
           </mc:Fallback>
@@ -461,7 +792,7 @@
         <mc:AlternateContent>
           <mc:Choice Requires="wps">
             <w:drawing>
-              <wp:anchor distT="0" distB="0" distL="114300" distR="114300" simplePos="0" relativeHeight="251686912" behindDoc="0" locked="0" layoutInCell="1" allowOverlap="1" wp14:anchorId="0B986526" wp14:editId="2C580834">
+              <wp:anchor distT="0" distB="0" distL="114300" distR="114300" simplePos="0" relativeHeight="251686912" behindDoc="0" locked="0" layoutInCell="1" allowOverlap="1" wp14:anchorId="0B986526" wp14:editId="5C814EFA">
                 <wp:simplePos x="0" y="0"/>
                 <wp:positionH relativeFrom="column">
                   <wp:posOffset>344424</wp:posOffset>
@@ -542,7 +873,7 @@
           </mc:Choice>
           <mc:Fallback>
             <w:pict>
-              <v:rect w14:anchorId="0B986526" id="_x0000_s1028" style="position:absolute;margin-left:27.1pt;margin-top:358.3pt;width:59.05pt;height:54pt;z-index:251686912;visibility:visible;mso-wrap-style:square;mso-wrap-distance-left:9pt;mso-wrap-distance-top:0;mso-wrap-distance-right:9pt;mso-wrap-distance-bottom:0;mso-position-horizontal:absolute;mso-position-horizontal-relative:text;mso-position-vertical:absolute;mso-position-vertical-relative:text;v-text-anchor:middle" o:gfxdata="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" fillcolor="#156082 [3204]" strokecolor="#030e13 [484]" strokeweight="1.5pt">
+              <v:rect w14:anchorId="0B986526" id="_x0000_s1029" style="position:absolute;margin-left:27.1pt;margin-top:358.3pt;width:59.05pt;height:54pt;z-index:251686912;visibility:visible;mso-wrap-style:square;mso-wrap-distance-left:9pt;mso-wrap-distance-top:0;mso-wrap-distance-right:9pt;mso-wrap-distance-bottom:0;mso-position-horizontal:absolute;mso-position-horizontal-relative:text;mso-position-vertical:absolute;mso-position-vertical-relative:text;v-text-anchor:middle" o:gfxdata="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" fillcolor="#156082 [3204]" strokecolor="#030e13 [484]" strokeweight="1.5pt">
                 <v:textbox>
                   <w:txbxContent>
                     <w:p>
@@ -569,77 +900,6 @@
                   </w:txbxContent>
                 </v:textbox>
               </v:rect>
-            </w:pict>
-          </mc:Fallback>
-        </mc:AlternateContent>
-      </w:r>
-      <w:r>
-        <w:rPr>
-          <w:noProof/>
-        </w:rPr>
-        <mc:AlternateContent>
-          <mc:Choice Requires="wps">
-            <w:drawing>
-              <wp:anchor distT="0" distB="0" distL="114300" distR="114300" simplePos="0" relativeHeight="251671552" behindDoc="0" locked="0" layoutInCell="1" allowOverlap="1" wp14:anchorId="06F69641" wp14:editId="556B5D87">
-                <wp:simplePos x="0" y="0"/>
-                <wp:positionH relativeFrom="column">
-                  <wp:posOffset>155448</wp:posOffset>
-                </wp:positionH>
-                <wp:positionV relativeFrom="paragraph">
-                  <wp:posOffset>2493264</wp:posOffset>
-                </wp:positionV>
-                <wp:extent cx="4973955" cy="2910840"/>
-                <wp:effectExtent l="0" t="0" r="17145" b="22860"/>
-                <wp:wrapNone/>
-                <wp:docPr id="646926162" name="Rectangle 11"/>
-                <wp:cNvGraphicFramePr/>
-                <a:graphic xmlns:a="http://schemas.openxmlformats.org/drawingml/2006/main">
-                  <a:graphicData uri="http://schemas.microsoft.com/office/word/2010/wordprocessingShape">
-                    <wps:wsp>
-                      <wps:cNvSpPr/>
-                      <wps:spPr>
-                        <a:xfrm>
-                          <a:off x="0" y="0"/>
-                          <a:ext cx="4973955" cy="2910840"/>
-                        </a:xfrm>
-                        <a:prstGeom prst="rect">
-                          <a:avLst/>
-                        </a:prstGeom>
-                      </wps:spPr>
-                      <wps:style>
-                        <a:lnRef idx="2">
-                          <a:schemeClr val="accent1">
-                            <a:shade val="15000"/>
-                          </a:schemeClr>
-                        </a:lnRef>
-                        <a:fillRef idx="1">
-                          <a:schemeClr val="accent1"/>
-                        </a:fillRef>
-                        <a:effectRef idx="0">
-                          <a:schemeClr val="accent1"/>
-                        </a:effectRef>
-                        <a:fontRef idx="minor">
-                          <a:schemeClr val="lt1"/>
-                        </a:fontRef>
-                      </wps:style>
-                      <wps:bodyPr rot="0" spcFirstLastPara="0" vertOverflow="overflow" horzOverflow="overflow" vert="horz" wrap="square" lIns="91440" tIns="45720" rIns="91440" bIns="45720" numCol="1" spcCol="0" rtlCol="0" fromWordArt="0" anchor="ctr" anchorCtr="0" forceAA="0" compatLnSpc="1">
-                        <a:prstTxWarp prst="textNoShape">
-                          <a:avLst/>
-                        </a:prstTxWarp>
-                        <a:noAutofit/>
-                      </wps:bodyPr>
-                    </wps:wsp>
-                  </a:graphicData>
-                </a:graphic>
-                <wp14:sizeRelV relativeFrom="margin">
-                  <wp14:pctHeight>0</wp14:pctHeight>
-                </wp14:sizeRelV>
-              </wp:anchor>
-            </w:drawing>
-          </mc:Choice>
-          <mc:Fallback>
-            <w:pict>
-              <v:rect w14:anchorId="64EBC888" id="Rectangle 11" o:spid="_x0000_s1026" style="position:absolute;margin-left:12.25pt;margin-top:196.3pt;width:391.65pt;height:229.2pt;z-index:251671552;visibility:visible;mso-wrap-style:square;mso-height-percent:0;mso-wrap-distance-left:9pt;mso-wrap-distance-top:0;mso-wrap-distance-right:9pt;mso-wrap-distance-bottom:0;mso-position-horizontal:absolute;mso-position-horizontal-relative:text;mso-position-vertical:absolute;mso-position-vertical-relative:text;mso-height-percent:0;mso-height-relative:margin;v-text-anchor:middle" o:gfxdata="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" fillcolor="#156082 [3204]" strokecolor="#030e13 [484]" strokeweight="1.5pt"/>
             </w:pict>
           </mc:Fallback>
         </mc:AlternateContent>
@@ -857,7 +1117,7 @@
         <mc:AlternateContent>
           <mc:Choice Requires="wps">
             <w:drawing>
-              <wp:anchor distT="0" distB="0" distL="114300" distR="114300" simplePos="0" relativeHeight="251682816" behindDoc="0" locked="0" layoutInCell="1" allowOverlap="1" wp14:anchorId="41759228" wp14:editId="41A557B9">
+              <wp:anchor distT="0" distB="0" distL="114300" distR="114300" simplePos="0" relativeHeight="251682816" behindDoc="0" locked="0" layoutInCell="1" allowOverlap="1" wp14:anchorId="41759228" wp14:editId="29CAF2DF">
                 <wp:simplePos x="0" y="0"/>
                 <wp:positionH relativeFrom="column">
                   <wp:posOffset>524256</wp:posOffset>
@@ -975,7 +1235,7 @@
           </mc:Choice>
           <mc:Fallback>
             <w:pict>
-              <v:shape w14:anchorId="41759228" id="Text Box 22" o:spid="_x0000_s1029" type="#_x0000_t202" style="position:absolute;margin-left:41.3pt;margin-top:327.6pt;width:220.75pt;height:17.75pt;z-index:251682816;visibility:visible;mso-wrap-style:square;mso-width-percent:0;mso-wrap-distance-left:9pt;mso-wrap-distance-top:0;mso-wrap-distance-right:9pt;mso-wrap-distance-bottom:0;mso-position-horizontal:absolute;mso-position-horizontal-relative:text;mso-position-vertical:absolute;mso-position-vertical-relative:text;mso-width-percent:0;mso-width-relative:margin;v-text-anchor:top" o:gfxdata="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" fillcolor="white [3201]" strokeweight=".5pt">
+              <v:shape w14:anchorId="41759228" id="Text Box 22" o:spid="_x0000_s1030" type="#_x0000_t202" style="position:absolute;margin-left:41.3pt;margin-top:327.6pt;width:220.75pt;height:17.75pt;z-index:251682816;visibility:visible;mso-wrap-style:square;mso-width-percent:0;mso-wrap-distance-left:9pt;mso-wrap-distance-top:0;mso-wrap-distance-right:9pt;mso-wrap-distance-bottom:0;mso-position-horizontal:absolute;mso-position-horizontal-relative:text;mso-position-vertical:absolute;mso-position-vertical-relative:text;mso-width-percent:0;mso-width-relative:margin;v-text-anchor:top" o:gfxdata="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" fillcolor="white [3201]" strokeweight=".5pt">
                 <v:textbox>
                   <w:txbxContent>
                     <w:p>
@@ -1055,219 +1315,6 @@
         <mc:AlternateContent>
           <mc:Choice Requires="wps">
             <w:drawing>
-              <wp:anchor distT="0" distB="0" distL="114300" distR="114300" simplePos="0" relativeHeight="251681792" behindDoc="0" locked="0" layoutInCell="1" allowOverlap="1" wp14:anchorId="702F85D1" wp14:editId="19F76C08">
-                <wp:simplePos x="0" y="0"/>
-                <wp:positionH relativeFrom="column">
-                  <wp:posOffset>1756833</wp:posOffset>
-                </wp:positionH>
-                <wp:positionV relativeFrom="paragraph">
-                  <wp:posOffset>3314700</wp:posOffset>
-                </wp:positionV>
-                <wp:extent cx="1092200" cy="605367"/>
-                <wp:effectExtent l="0" t="0" r="12700" b="23495"/>
-                <wp:wrapNone/>
-                <wp:docPr id="1183498678" name="Text Box 21"/>
-                <wp:cNvGraphicFramePr/>
-                <a:graphic xmlns:a="http://schemas.openxmlformats.org/drawingml/2006/main">
-                  <a:graphicData uri="http://schemas.microsoft.com/office/word/2010/wordprocessingShape">
-                    <wps:wsp>
-                      <wps:cNvSpPr txBox="1"/>
-                      <wps:spPr>
-                        <a:xfrm>
-                          <a:off x="0" y="0"/>
-                          <a:ext cx="1092200" cy="605367"/>
-                        </a:xfrm>
-                        <a:prstGeom prst="rect">
-                          <a:avLst/>
-                        </a:prstGeom>
-                        <a:solidFill>
-                          <a:schemeClr val="lt1"/>
-                        </a:solidFill>
-                        <a:ln w="6350">
-                          <a:solidFill>
-                            <a:prstClr val="black"/>
-                          </a:solidFill>
-                        </a:ln>
-                      </wps:spPr>
-                      <wps:txbx>
-                        <w:txbxContent>
-                          <w:p>
-                            <w:pPr>
-                              <w:rPr>
-                                <w:sz w:val="14"/>
-                                <w:szCs w:val="14"/>
-                              </w:rPr>
-                            </w:pPr>
-                            <w:proofErr w:type="spellStart"/>
-                            <w:r>
-                              <w:rPr>
-                                <w:sz w:val="14"/>
-                                <w:szCs w:val="14"/>
-                              </w:rPr>
-                              <w:t>onSomeDataChanged</w:t>
-                            </w:r>
-                            <w:proofErr w:type="spellEnd"/>
-                            <w:r>
-                              <w:rPr>
-                                <w:sz w:val="14"/>
-                                <w:szCs w:val="14"/>
-                              </w:rPr>
-                              <w:t>(data</w:t>
-                            </w:r>
-                            <w:proofErr w:type="gramStart"/>
-                            <w:r>
-                              <w:rPr>
-                                <w:sz w:val="14"/>
-                                <w:szCs w:val="14"/>
-                              </w:rPr>
-                              <w:t xml:space="preserve">){ </w:t>
-                            </w:r>
-                            <w:proofErr w:type="spellStart"/>
-                            <w:r>
-                              <w:rPr>
-                                <w:sz w:val="14"/>
-                                <w:szCs w:val="14"/>
-                              </w:rPr>
-                              <w:t>someDataChanged</w:t>
-                            </w:r>
-                            <w:r>
-                              <w:rPr>
-                                <w:sz w:val="14"/>
-                                <w:szCs w:val="14"/>
-                              </w:rPr>
-                              <w:t>.emit</w:t>
-                            </w:r>
-                            <w:proofErr w:type="spellEnd"/>
-                            <w:proofErr w:type="gramEnd"/>
-                            <w:r>
-                              <w:rPr>
-                                <w:sz w:val="14"/>
-                                <w:szCs w:val="14"/>
-                              </w:rPr>
-                              <w:t>(</w:t>
-                            </w:r>
-                            <w:proofErr w:type="spellStart"/>
-                            <w:r>
-                              <w:rPr>
-                                <w:sz w:val="14"/>
-                                <w:szCs w:val="14"/>
-                              </w:rPr>
-                              <w:t>secondData</w:t>
-                            </w:r>
-                            <w:proofErr w:type="spellEnd"/>
-                            <w:r>
-                              <w:rPr>
-                                <w:sz w:val="14"/>
-                                <w:szCs w:val="14"/>
-                              </w:rPr>
-                              <w:t>)}</w:t>
-                            </w:r>
-                          </w:p>
-                        </w:txbxContent>
-                      </wps:txbx>
-                      <wps:bodyPr rot="0" spcFirstLastPara="0" vertOverflow="overflow" horzOverflow="overflow" vert="horz" wrap="square" lIns="91440" tIns="45720" rIns="91440" bIns="45720" numCol="1" spcCol="0" rtlCol="0" fromWordArt="0" anchor="t" anchorCtr="0" forceAA="0" compatLnSpc="1">
-                        <a:prstTxWarp prst="textNoShape">
-                          <a:avLst/>
-                        </a:prstTxWarp>
-                        <a:noAutofit/>
-                      </wps:bodyPr>
-                    </wps:wsp>
-                  </a:graphicData>
-                </a:graphic>
-              </wp:anchor>
-            </w:drawing>
-          </mc:Choice>
-          <mc:Fallback>
-            <w:pict>
-              <v:shape w14:anchorId="702F85D1" id="Text Box 21" o:spid="_x0000_s1030" type="#_x0000_t202" style="position:absolute;margin-left:138.35pt;margin-top:261pt;width:86pt;height:47.65pt;z-index:251681792;visibility:visible;mso-wrap-style:square;mso-wrap-distance-left:9pt;mso-wrap-distance-top:0;mso-wrap-distance-right:9pt;mso-wrap-distance-bottom:0;mso-position-horizontal:absolute;mso-position-horizontal-relative:text;mso-position-vertical:absolute;mso-position-vertical-relative:text;v-text-anchor:top" o:gfxdata="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" fillcolor="white [3201]" strokeweight=".5pt">
-                <v:textbox>
-                  <w:txbxContent>
-                    <w:p>
-                      <w:pPr>
-                        <w:rPr>
-                          <w:sz w:val="14"/>
-                          <w:szCs w:val="14"/>
-                        </w:rPr>
-                      </w:pPr>
-                      <w:proofErr w:type="spellStart"/>
-                      <w:r>
-                        <w:rPr>
-                          <w:sz w:val="14"/>
-                          <w:szCs w:val="14"/>
-                        </w:rPr>
-                        <w:t>onSomeDataChanged</w:t>
-                      </w:r>
-                      <w:proofErr w:type="spellEnd"/>
-                      <w:r>
-                        <w:rPr>
-                          <w:sz w:val="14"/>
-                          <w:szCs w:val="14"/>
-                        </w:rPr>
-                        <w:t>(data</w:t>
-                      </w:r>
-                      <w:proofErr w:type="gramStart"/>
-                      <w:r>
-                        <w:rPr>
-                          <w:sz w:val="14"/>
-                          <w:szCs w:val="14"/>
-                        </w:rPr>
-                        <w:t xml:space="preserve">){ </w:t>
-                      </w:r>
-                      <w:proofErr w:type="spellStart"/>
-                      <w:r>
-                        <w:rPr>
-                          <w:sz w:val="14"/>
-                          <w:szCs w:val="14"/>
-                        </w:rPr>
-                        <w:t>someDataChanged</w:t>
-                      </w:r>
-                      <w:r>
-                        <w:rPr>
-                          <w:sz w:val="14"/>
-                          <w:szCs w:val="14"/>
-                        </w:rPr>
-                        <w:t>.emit</w:t>
-                      </w:r>
-                      <w:proofErr w:type="spellEnd"/>
-                      <w:proofErr w:type="gramEnd"/>
-                      <w:r>
-                        <w:rPr>
-                          <w:sz w:val="14"/>
-                          <w:szCs w:val="14"/>
-                        </w:rPr>
-                        <w:t>(</w:t>
-                      </w:r>
-                      <w:proofErr w:type="spellStart"/>
-                      <w:r>
-                        <w:rPr>
-                          <w:sz w:val="14"/>
-                          <w:szCs w:val="14"/>
-                        </w:rPr>
-                        <w:t>secondData</w:t>
-                      </w:r>
-                      <w:proofErr w:type="spellEnd"/>
-                      <w:r>
-                        <w:rPr>
-                          <w:sz w:val="14"/>
-                          <w:szCs w:val="14"/>
-                        </w:rPr>
-                        <w:t>)}</w:t>
-                      </w:r>
-                    </w:p>
-                  </w:txbxContent>
-                </v:textbox>
-              </v:shape>
-            </w:pict>
-          </mc:Fallback>
-        </mc:AlternateContent>
-      </w:r>
-      <w:r>
-        <w:rPr>
-          <w:noProof/>
-        </w:rPr>
-        <mc:AlternateContent>
-          <mc:Choice Requires="wps">
-            <w:drawing>
               <wp:anchor distT="0" distB="0" distL="114300" distR="114300" simplePos="0" relativeHeight="251680768" behindDoc="0" locked="0" layoutInCell="1" allowOverlap="1" wp14:anchorId="4ECCB5D5" wp14:editId="4B40D3A4">
                 <wp:simplePos x="0" y="0"/>
                 <wp:positionH relativeFrom="column">
@@ -1447,12 +1494,32 @@
                           <w:p>
                             <w:pPr>
                               <w:jc w:val="center"/>
+                              <w:rPr>
+                                <w:sz w:val="16"/>
+                                <w:szCs w:val="16"/>
+                              </w:rPr>
                             </w:pPr>
                             <w:proofErr w:type="spellStart"/>
                             <w:r>
-                              <w:t>Seconddata</w:t>
+                              <w:rPr>
+                                <w:sz w:val="16"/>
+                                <w:szCs w:val="16"/>
+                              </w:rPr>
+                              <w:t>filterValue</w:t>
                             </w:r>
                             <w:proofErr w:type="spellEnd"/>
+                            <w:r>
+                              <w:rPr>
+                                <w:sz w:val="16"/>
+                                <w:szCs w:val="16"/>
+                              </w:rPr>
+                              <w:t>=’’</w:t>
+                            </w:r>
+                          </w:p>
+                          <w:p>
+                            <w:pPr>
+                              <w:jc w:val="center"/>
+                            </w:pPr>
                             <w:r>
                               <w:t>=0</w:t>
                             </w:r>
@@ -1485,12 +1552,32 @@
                     <w:p>
                       <w:pPr>
                         <w:jc w:val="center"/>
+                        <w:rPr>
+                          <w:sz w:val="16"/>
+                          <w:szCs w:val="16"/>
+                        </w:rPr>
                       </w:pPr>
                       <w:proofErr w:type="spellStart"/>
                       <w:r>
-                        <w:t>Seconddata</w:t>
+                        <w:rPr>
+                          <w:sz w:val="16"/>
+                          <w:szCs w:val="16"/>
+                        </w:rPr>
+                        <w:t>filterValue</w:t>
                       </w:r>
                       <w:proofErr w:type="spellEnd"/>
+                      <w:r>
+                        <w:rPr>
+                          <w:sz w:val="16"/>
+                          <w:szCs w:val="16"/>
+                        </w:rPr>
+                        <w:t>=’’</w:t>
+                      </w:r>
+                    </w:p>
+                    <w:p>
+                      <w:pPr>
+                        <w:jc w:val="center"/>
+                      </w:pPr>
                       <w:r>
                         <w:t>=0</w:t>
                       </w:r>
@@ -1840,6 +1927,19 @@
                             </w:pPr>
                             <w:proofErr w:type="spellStart"/>
                             <w:r>
+                              <w:t>filterTextValue</w:t>
+                            </w:r>
+                            <w:proofErr w:type="spellEnd"/>
+                            <w:r>
+                              <w:t>=’’</w:t>
+                            </w:r>
+                          </w:p>
+                          <w:p>
+                            <w:pPr>
+                              <w:jc w:val="center"/>
+                            </w:pPr>
+                            <w:proofErr w:type="spellStart"/>
+                            <w:r>
                               <w:t>updateData</w:t>
                             </w:r>
                             <w:proofErr w:type="spellEnd"/>
@@ -1852,12 +1952,22 @@
                               <w:jc w:val="center"/>
                             </w:pPr>
                             <w:proofErr w:type="spellStart"/>
+                            <w:proofErr w:type="gramStart"/>
                             <w:r>
-                              <w:t>this.data</w:t>
+                              <w:t>this.</w:t>
+                            </w:r>
+                            <w:r>
+                              <w:t>filterTextValue</w:t>
                             </w:r>
                             <w:proofErr w:type="spellEnd"/>
+                            <w:proofErr w:type="gramEnd"/>
+                          </w:p>
+                          <w:p>
+                            <w:pPr>
+                              <w:jc w:val="center"/>
+                            </w:pPr>
                             <w:r>
-                              <w:t xml:space="preserve"> = value</w:t>
+                              <w:t>= value</w:t>
                             </w:r>
                           </w:p>
                         </w:txbxContent>
@@ -1891,6 +2001,19 @@
                       </w:pPr>
                       <w:proofErr w:type="spellStart"/>
                       <w:r>
+                        <w:t>filterTextValue</w:t>
+                      </w:r>
+                      <w:proofErr w:type="spellEnd"/>
+                      <w:r>
+                        <w:t>=’’</w:t>
+                      </w:r>
+                    </w:p>
+                    <w:p>
+                      <w:pPr>
+                        <w:jc w:val="center"/>
+                      </w:pPr>
+                      <w:proofErr w:type="spellStart"/>
+                      <w:r>
                         <w:t>updateData</w:t>
                       </w:r>
                       <w:proofErr w:type="spellEnd"/>
@@ -1903,12 +2026,22 @@
                         <w:jc w:val="center"/>
                       </w:pPr>
                       <w:proofErr w:type="spellStart"/>
+                      <w:proofErr w:type="gramStart"/>
                       <w:r>
-                        <w:t>this.data</w:t>
+                        <w:t>this.</w:t>
+                      </w:r>
+                      <w:r>
+                        <w:t>filterTextValue</w:t>
                       </w:r>
                       <w:proofErr w:type="spellEnd"/>
+                      <w:proofErr w:type="gramEnd"/>
+                    </w:p>
+                    <w:p>
+                      <w:pPr>
+                        <w:jc w:val="center"/>
+                      </w:pPr>
                       <w:r>
-                        <w:t xml:space="preserve"> = value</w:t>
+                        <w:t>= value</w:t>
                       </w:r>
                     </w:p>
                   </w:txbxContent>
@@ -3324,7 +3457,6 @@
   <w:style w:type="character" w:default="1" w:styleId="DefaultParagraphFont">
     <w:name w:val="Default Paragraph Font"/>
     <w:uiPriority w:val="1"/>
-    <w:semiHidden/>
     <w:unhideWhenUsed/>
   </w:style>
   <w:style w:type="table" w:default="1" w:styleId="TableNormal">

</xml_diff>